<commit_message>
fix: x86 libonnxruntime.so 중복으로 mergeDebugNativeLibs 실패 → APK ABI 를 arm64-v8a 로 제한
- 원인: sherpa-onnx-static-link-onnxruntime-1.13.7.aar 는 x86 에서만
  libonnxruntime.so(ORT 1.27.1)를 따로 동적 링크해 넣는다(readelf NEEDED 확인).
  onnxruntime-android 1.25.1 도 lib/x86/libonnxruntime.so 를 넣어 경로가 겹쳤다.
  arm64-v8a / armeabi-v7a / x86_64 는 onnxruntime 을 정적으로 품어 충돌이 없다.
- 수정: app/build.gradle.kts defaultConfig.ndk.abiFilters += "arm64-v8a" (사용자 결정 Q21)
  대상 기기 S25 Ultra 는 arm64-v8a. pickFirst(두 ORT 판 섞임)는 쓰지 않는다.
- 검증: PC 에서 받은 실제 AAR 의 classes.jar 로 앱 소스 37개 전체 컴파일 오류 0건.
- 문서: README(대상 기기·알려진 제한), RELEASE_NOTES_v2.1.0(MD/DOCX), HANDOFF_20261010_v2.1.0
  판 번호는 아직 배포되지 않은 2.1.0 안의 수정이라 2.1.0 유지.

Co-Authored-By: Claude Opus 5.5 <noreply@anthropic.com>
Claude-Session: https://claude.ai/code/session_01Tx1hB5ciP2kUveuy9cJMpc
</commit_message>
<xml_diff>
--- a/docs/RELEASE_NOTES_v2.1.0.docx
+++ b/docs/RELEASE_NOTES_v2.1.0.docx
@@ -868,6 +868,74 @@
     </w:p>
     <w:p>
       <w:pPr>
+        <w:pStyle w:val="ListParagraph"/>
+        <w:numPr>
+          <w:ilvl w:val="0"/>
+          <w:numId w:val="2"/>
+        </w:numPr>
+        <w:spacing w:after="60"/>
+      </w:pPr>
+      <w:r>
+        <w:t xml:space="preserve">APK 에 넣는 ABI 를 </w:t>
+      </w:r>
+      <w:r>
+        <w:rPr>
+          <w:b/>
+          <w:bCs/>
+        </w:rPr>
+        <w:t xml:space="preserve">arm64-v8a 하나</w:t>
+      </w:r>
+      <w:r>
+        <w:t xml:space="preserve">로 제한했다(</w:t>
+      </w:r>
+      <w:r>
+        <w:rPr>
+          <w:rFonts w:ascii="Consolas" w:cs="Consolas" w:eastAsia="Consolas" w:hAnsi="Consolas"/>
+        </w:rPr>
+        <w:t xml:space="preserve">app/build.gradle.kts</w:t>
+      </w:r>
+      <w:r>
+        <w:t xml:space="preserve"> 의 </w:t>
+      </w:r>
+      <w:r>
+        <w:rPr>
+          <w:rFonts w:ascii="Consolas" w:cs="Consolas" w:eastAsia="Consolas" w:hAnsi="Consolas"/>
+        </w:rPr>
+        <w:t xml:space="preserve">ndk.abiFilters</w:t>
+      </w:r>
+      <w:r>
+        <w:t xml:space="preserve">). sherpa 정적 링크 AAR 은 x86 에서만 </w:t>
+      </w:r>
+      <w:r>
+        <w:rPr>
+          <w:rFonts w:ascii="Consolas" w:cs="Consolas" w:eastAsia="Consolas" w:hAnsi="Consolas"/>
+        </w:rPr>
+        <w:t xml:space="preserve">libonnxruntime.so</w:t>
+      </w:r>
+      <w:r>
+        <w:t xml:space="preserve">(ORT 1.27.1)를 따로 넣어, 앱의 onnxruntime-android 1.25.1 과 </w:t>
+      </w:r>
+      <w:r>
+        <w:rPr>
+          <w:rFonts w:ascii="Consolas" w:cs="Consolas" w:eastAsia="Consolas" w:hAnsi="Consolas"/>
+        </w:rPr>
+        <w:t xml:space="preserve">lib/x86/libonnxruntime.so</w:t>
+      </w:r>
+      <w:r>
+        <w:t xml:space="preserve"> 경로가 겹쳐 빌드(</w:t>
+      </w:r>
+      <w:r>
+        <w:rPr>
+          <w:rFonts w:ascii="Consolas" w:cs="Consolas" w:eastAsia="Consolas" w:hAnsi="Consolas"/>
+        </w:rPr>
+        <w:t xml:space="preserve">mergeDebugNativeLibs</w:t>
+      </w:r>
+      <w:r>
+        <w:t xml:space="preserve">)가 실패했기 때문이다. 에뮬레이터·32비트 기기에는 설치되지 않는다.</w:t>
+      </w:r>
+    </w:p>
+    <w:p>
+      <w:pPr>
         <w:pStyle w:val="Heading1"/>
         <w:spacing w:after="120" w:before="240"/>
       </w:pPr>
@@ -1344,14 +1412,25 @@
           </w:tcPr>
           <w:p>
             <w:r>
-              <w:rPr>
-                <w:b/>
-                <w:bCs/>
-              </w:rPr>
-              <w:t xml:space="preserve">미실행</w:t>
-            </w:r>
-            <w:r>
-              <w:t xml:space="preserve"> — AAR 을 받은 뒤 확인 필요</w:t>
+              <w:t xml:space="preserve">완료(2026-10-10) — PC 에서 받은 AAR(sha256 </w:t>
+            </w:r>
+            <w:r>
+              <w:rPr>
+                <w:rFonts w:ascii="Consolas" w:cs="Consolas" w:eastAsia="Consolas" w:hAnsi="Consolas"/>
+              </w:rPr>
+              <w:t xml:space="preserve">220d7cb2…</w:t>
+            </w:r>
+            <w:r>
+              <w:t xml:space="preserve">)의 classes.jar 로 앱 소스 37개 전체 컴파일 오류 0건. readelf 로 ABI 별 네이티브 의존성 확인(arm64-v8a·armeabi-v7a·x86_64 는 onnxruntime 정적 포함, x86 만 </w:t>
+            </w:r>
+            <w:r>
+              <w:rPr>
+                <w:rFonts w:ascii="Consolas" w:cs="Consolas" w:eastAsia="Consolas" w:hAnsi="Consolas"/>
+              </w:rPr>
+              <w:t xml:space="preserve">libonnxruntime.so</w:t>
+            </w:r>
+            <w:r>
+              <w:t xml:space="preserve"> 동적 링크)</w:t>
             </w:r>
           </w:p>
         </w:tc>
@@ -1375,7 +1454,71 @@
           </w:tcPr>
           <w:p>
             <w:r>
-              <w:t xml:space="preserve">Gradle 빌드·실기기(S25 Ultra)</w:t>
+              <w:t xml:space="preserve">Gradle 빌드</w:t>
+            </w:r>
+          </w:p>
+        </w:tc>
+        <w:tc>
+          <w:tcPr>
+            <w:tcW w:type="dxa" w:w="6747"/>
+            <w:tcBorders>
+              <w:top w:val="single" w:color="A0A0A0" w:sz="4"/>
+              <w:left w:val="single" w:color="A0A0A0" w:sz="4"/>
+              <w:bottom w:val="single" w:color="A0A0A0" w:sz="4"/>
+              <w:right w:val="single" w:color="A0A0A0" w:sz="4"/>
+            </w:tcBorders>
+            <w:tcMar>
+              <w:top w:type="dxa" w:w="60"/>
+              <w:left w:type="dxa" w:w="100"/>
+              <w:bottom w:type="dxa" w:w="60"/>
+              <w:right w:type="dxa" w:w="100"/>
+            </w:tcMar>
+          </w:tcPr>
+          <w:p>
+            <w:r>
+              <w:t xml:space="preserve">1차 실패(x86 </w:t>
+            </w:r>
+            <w:r>
+              <w:rPr>
+                <w:rFonts w:ascii="Consolas" w:cs="Consolas" w:eastAsia="Consolas" w:hAnsi="Consolas"/>
+              </w:rPr>
+              <w:t xml:space="preserve">libonnxruntime.so</w:t>
+            </w:r>
+            <w:r>
+              <w:t xml:space="preserve"> 중복) → </w:t>
+            </w:r>
+            <w:r>
+              <w:rPr>
+                <w:rFonts w:ascii="Consolas" w:cs="Consolas" w:eastAsia="Consolas" w:hAnsi="Consolas"/>
+              </w:rPr>
+              <w:t xml:space="preserve">abiFilters</w:t>
+            </w:r>
+            <w:r>
+              <w:t xml:space="preserve"> 로 arm64-v8a 만 남기도록 수정, 다시 빌드 확인 필요</w:t>
+            </w:r>
+          </w:p>
+        </w:tc>
+      </w:tr>
+      <w:tr>
+        <w:tc>
+          <w:tcPr>
+            <w:tcW w:type="dxa" w:w="2891"/>
+            <w:tcBorders>
+              <w:top w:val="single" w:color="A0A0A0" w:sz="4"/>
+              <w:left w:val="single" w:color="A0A0A0" w:sz="4"/>
+              <w:bottom w:val="single" w:color="A0A0A0" w:sz="4"/>
+              <w:right w:val="single" w:color="A0A0A0" w:sz="4"/>
+            </w:tcBorders>
+            <w:tcMar>
+              <w:top w:type="dxa" w:w="60"/>
+              <w:left w:type="dxa" w:w="100"/>
+              <w:bottom w:type="dxa" w:w="60"/>
+              <w:right w:type="dxa" w:w="100"/>
+            </w:tcMar>
+          </w:tcPr>
+          <w:p>
+            <w:r>
+              <w:t xml:space="preserve">실기기(S25 Ultra)</w:t>
             </w:r>
           </w:p>
         </w:tc>
@@ -1480,7 +1623,25 @@
         <w:spacing w:after="60"/>
       </w:pPr>
       <w:r>
-        <w:t xml:space="preserve">APK 에 sherpa AAR 의 4개 ABI(arm64-v8a 외)가 모두 들어가 크기가 커진다(줄이려면 abiFilters 로 arm64-v8a 만 남기는 결정 필요).</w:t>
+        <w:t xml:space="preserve">APK 는 arm64-v8a 전용이다. 에뮬레이터용으로 x86_64 를 더하려면 </w:t>
+      </w:r>
+      <w:r>
+        <w:rPr>
+          <w:rFonts w:ascii="Consolas" w:cs="Consolas" w:eastAsia="Consolas" w:hAnsi="Consolas"/>
+        </w:rPr>
+        <w:t xml:space="preserve">abiFilters</w:t>
+      </w:r>
+      <w:r>
+        <w:t xml:space="preserve"> 에 추가하면 된다(x86_64 는 정적이라 충돌 없음). 단 TEN VAD </w:t>
+      </w:r>
+      <w:r>
+        <w:rPr>
+          <w:rFonts w:ascii="Consolas" w:cs="Consolas" w:eastAsia="Consolas" w:hAnsi="Consolas"/>
+        </w:rPr>
+        <w:t xml:space="preserve">.so</w:t>
+      </w:r>
+      <w:r>
+        <w:t xml:space="preserve"> 는 공식 x86_64 판이 없다.</w:t>
       </w:r>
     </w:p>
     <w:sectPr>

</xml_diff>

<commit_message>
fix: abiFilters 만으로 풀리지 않던 x86 libonnxruntime.so 중복 → packaging.jniLibs.excludes 추가
- 2차 빌드도 같은 DuplicateRelativeFileException. AGP MergeNativeLibsTask 는 abiFilters 를 보지 않고
  모든 ABI 를 합치며 중복을 검사하고, abiFilters 는 PackageAndroidArtifact(패키징)에서만 적용된다.
- 수정: android { packaging { jniLibs { excludes += "lib/x86/libonnxruntime.so" } } }
  excludes 에 걸린 파일은 합치기·중복 검사에서 통째로 빠진다. x86 은 abiFilters(arm64-v8a)로 APK 에
  어차피 들어가지 않는다. 두 ORT 판 중 하나를 고르는 pickFirsts 는 쓰지 않는다.
- 이전 커밋의 build.gradle.kts 주석(abiFilters 로 해결된다는 설명)을 change- 주석으로 정정.
- 검증: AGP 공식 소스의 합치기 규칙을 옮긴 모의 실행에 PC 의 실제 AAR 7개 + jniLibs 를 넣어
  1·2차 실패를 똑같이 재현, 수정안은 통과(APK lib 6개, 모두 arm64-v8a).
- 문서: README, RELEASE_NOTES_v2.1.0(MD/DOCX), HANDOFF_20261010_v2.1.0

Co-Authored-By: Claude Opus 5.5 <noreply@anthropic.com>
Claude-Session: https://claude.ai/code/session_01Tx1hB5ciP2kUveuy9cJMpc
</commit_message>
<xml_diff>
--- a/docs/RELEASE_NOTES_v2.1.0.docx
+++ b/docs/RELEASE_NOTES_v2.1.0.docx
@@ -904,34 +904,56 @@
         <w:t xml:space="preserve">ndk.abiFilters</w:t>
       </w:r>
       <w:r>
-        <w:t xml:space="preserve">). sherpa 정적 링크 AAR 은 x86 에서만 </w:t>
+        <w:t xml:space="preserve">). 에뮬레이터·32비트 기기에는 설치되지 않는다.</w:t>
+      </w:r>
+    </w:p>
+    <w:p>
+      <w:pPr>
+        <w:pStyle w:val="ListParagraph"/>
+        <w:numPr>
+          <w:ilvl w:val="0"/>
+          <w:numId w:val="2"/>
+        </w:numPr>
+        <w:spacing w:after="60"/>
+      </w:pPr>
+      <w:r>
+        <w:t xml:space="preserve">네이티브 합치기 중복 해결: </w:t>
       </w:r>
       <w:r>
         <w:rPr>
           <w:rFonts w:ascii="Consolas" w:cs="Consolas" w:eastAsia="Consolas" w:hAnsi="Consolas"/>
         </w:rPr>
+        <w:t xml:space="preserve">packaging.jniLibs.excludes += "lib/x86/libonnxruntime.so"</w:t>
+      </w:r>
+      <w:r>
+        <w:t xml:space="preserve">. sherpa 정적 링크 AAR 은 x86 에서만 </w:t>
+      </w:r>
+      <w:r>
+        <w:rPr>
+          <w:rFonts w:ascii="Consolas" w:cs="Consolas" w:eastAsia="Consolas" w:hAnsi="Consolas"/>
+        </w:rPr>
         <w:t xml:space="preserve">libonnxruntime.so</w:t>
       </w:r>
       <w:r>
-        <w:t xml:space="preserve">(ORT 1.27.1)를 따로 넣어, 앱의 onnxruntime-android 1.25.1 과 </w:t>
+        <w:t xml:space="preserve">(ORT 1.27.1)를 따로 넣어, 앱의 onnxruntime-android 1.25.1 과 경로가 겹쳐 빌드(</w:t>
       </w:r>
       <w:r>
         <w:rPr>
           <w:rFonts w:ascii="Consolas" w:cs="Consolas" w:eastAsia="Consolas" w:hAnsi="Consolas"/>
         </w:rPr>
-        <w:t xml:space="preserve">lib/x86/libonnxruntime.so</w:t>
-      </w:r>
-      <w:r>
-        <w:t xml:space="preserve"> 경로가 겹쳐 빌드(</w:t>
+        <w:t xml:space="preserve">mergeDebugNativeLibs</w:t>
+      </w:r>
+      <w:r>
+        <w:t xml:space="preserve">)가 실패했다. </w:t>
       </w:r>
       <w:r>
         <w:rPr>
           <w:rFonts w:ascii="Consolas" w:cs="Consolas" w:eastAsia="Consolas" w:hAnsi="Consolas"/>
         </w:rPr>
-        <w:t xml:space="preserve">mergeDebugNativeLibs</w:t>
-      </w:r>
-      <w:r>
-        <w:t xml:space="preserve">)가 실패했기 때문이다. 에뮬레이터·32비트 기기에는 설치되지 않는다.</w:t>
+        <w:t xml:space="preserve">abiFilters</w:t>
+      </w:r>
+      <w:r>
+        <w:t xml:space="preserve"> 는 합치기(중복 검사) 뒤 APK 패키징 단계에서만 적용되어 이 오류를 막지 못한다(2차 빌드에서 확인).</w:t>
       </w:r>
     </w:p>
     <w:p>
@@ -1476,7 +1498,7 @@
           </w:tcPr>
           <w:p>
             <w:r>
-              <w:t xml:space="preserve">1차 실패(x86 </w:t>
+              <w:t xml:space="preserve">1차·2차 실패(x86 </w:t>
             </w:r>
             <w:r>
               <w:rPr>
@@ -1485,7 +1507,7 @@
               <w:t xml:space="preserve">libonnxruntime.so</w:t>
             </w:r>
             <w:r>
-              <w:t xml:space="preserve"> 중복) → </w:t>
+              <w:t xml:space="preserve"> 중복, 2차는 </w:t>
             </w:r>
             <w:r>
               <w:rPr>
@@ -1494,7 +1516,16 @@
               <w:t xml:space="preserve">abiFilters</w:t>
             </w:r>
             <w:r>
-              <w:t xml:space="preserve"> 로 arm64-v8a 만 남기도록 수정, 다시 빌드 확인 필요</w:t>
+              <w:t xml:space="preserve"> 만 넣은 상태) → </w:t>
+            </w:r>
+            <w:r>
+              <w:rPr>
+                <w:rFonts w:ascii="Consolas" w:cs="Consolas" w:eastAsia="Consolas" w:hAnsi="Consolas"/>
+              </w:rPr>
+              <w:t xml:space="preserve">packaging.jniLibs.excludes</w:t>
+            </w:r>
+            <w:r>
+              <w:t xml:space="preserve"> 추가. AGP 공식 소스의 합치기 규칙을 그대로 옮긴 모의 실행에 PC 의 실제 AAR 7개 + jniLibs 를 넣어 1·2차 실패를 똑같이 재현하고, 수정안은 통과(APK lib 6개, 모두 arm64-v8a) 확인. 실제 Gradle 빌드 확인 필요</w:t>
             </w:r>
           </w:p>
         </w:tc>

</xml_diff>

<commit_message>
feat: Logcat 디버그 메시지 추가(sherpa + 배치 단계 경계) — [D][batch/file/stt/sherpa]
- 사용자 결정 Q22(범위: sherpa + 배치 단계 경계, 파일·단계·조각 단위, 화면 로그창 제외),
  Q23(태그 GoogleStt 하나 + 메시지 접두어 [D][단계]).
- SherpaOfflineTranscriber: logDirReport(모델 폴더·파일 존재/읽기 권한/크기), load start(역할별 절대 경로)/done(ms),
  조각별 start(샘플 수·길이)/done(디코딩 ms·글자 수), qwen3 언어 옵션, transcribe 요약, close.
- BatchRunner: 배치 start(실행 조건 한 줄)/end/중단 사유, warm-up 결과, 파일 start/end, 디코딩 상세,
  STT 입력 조각 길이 목록·결과 요약, sherpa 모델 누락 시 폴더 보고, finally.
- 기존 코드는 바꾸지 않고 추가만(93줄). 화면 로그(appendLog)는 원래대로 Log.i 로 Logcat 에도 나간다.
- 검증: 실제 AAR classes.jar 로 앱 소스 전체 컴파일 오류 0건, 주석 중첩 검사 0건.
- 문서: README(3장 6. Logcat 보기), RELEASE_NOTES_v2.1.0(MD/DOCX), HANDOFF_20261010_v2.1.0

Co-Authored-By: Claude Opus 5.5 <noreply@anthropic.com>
Claude-Session: https://claude.ai/code/session_01Tx1hB5ciP2kUveuy9cJMpc
</commit_message>
<xml_diff>
--- a/docs/RELEASE_NOTES_v2.1.0.docx
+++ b/docs/RELEASE_NOTES_v2.1.0.docx
@@ -749,6 +749,73 @@
     </w:p>
     <w:p>
       <w:pPr>
+        <w:pStyle w:val="ListParagraph"/>
+        <w:numPr>
+          <w:ilvl w:val="0"/>
+          <w:numId w:val="3"/>
+        </w:numPr>
+        <w:spacing w:after="60"/>
+      </w:pPr>
+      <w:r>
+        <w:t xml:space="preserve">Logcat 디버그 출력(태그 </w:t>
+      </w:r>
+      <w:r>
+        <w:rPr>
+          <w:rFonts w:ascii="Consolas" w:cs="Consolas" w:eastAsia="Consolas" w:hAnsi="Consolas"/>
+        </w:rPr>
+        <w:t xml:space="preserve">GoogleStt</w:t>
+      </w:r>
+      <w:r>
+        <w:t xml:space="preserve">, 접두어 </w:t>
+      </w:r>
+      <w:r>
+        <w:rPr>
+          <w:rFonts w:ascii="Consolas" w:cs="Consolas" w:eastAsia="Consolas" w:hAnsi="Consolas"/>
+        </w:rPr>
+        <w:t xml:space="preserve">[D][batch]</w:t>
+      </w:r>
+      <w:r>
+        <w:t xml:space="preserve"> / </w:t>
+      </w:r>
+      <w:r>
+        <w:rPr>
+          <w:rFonts w:ascii="Consolas" w:cs="Consolas" w:eastAsia="Consolas" w:hAnsi="Consolas"/>
+        </w:rPr>
+        <w:t xml:space="preserve">[D][file]</w:t>
+      </w:r>
+      <w:r>
+        <w:t xml:space="preserve"> / </w:t>
+      </w:r>
+      <w:r>
+        <w:rPr>
+          <w:rFonts w:ascii="Consolas" w:cs="Consolas" w:eastAsia="Consolas" w:hAnsi="Consolas"/>
+        </w:rPr>
+        <w:t xml:space="preserve">[D][stt]</w:t>
+      </w:r>
+      <w:r>
+        <w:t xml:space="preserve"> / </w:t>
+      </w:r>
+      <w:r>
+        <w:rPr>
+          <w:rFonts w:ascii="Consolas" w:cs="Consolas" w:eastAsia="Consolas" w:hAnsi="Consolas"/>
+        </w:rPr>
+        <w:t xml:space="preserve">[D][sherpa]</w:t>
+      </w:r>
+      <w:r>
+        <w:t xml:space="preserve">, Log.d). 화면 로그창에는 넣지 않는다. 파일·단계·조각 단위로만 남기고 프레임 단위 출력은 없다. 필터 예: </w:t>
+      </w:r>
+      <w:r>
+        <w:rPr>
+          <w:rFonts w:ascii="Consolas" w:cs="Consolas" w:eastAsia="Consolas" w:hAnsi="Consolas"/>
+        </w:rPr>
+        <w:t xml:space="preserve">tag:GoogleStt message:[D]</w:t>
+      </w:r>
+      <w:r>
+        <w:t xml:space="preserve">.</w:t>
+      </w:r>
+    </w:p>
+    <w:p>
+      <w:pPr>
         <w:pStyle w:val="Heading1"/>
         <w:spacing w:after="120" w:before="240"/>
       </w:pPr>
@@ -1525,7 +1592,7 @@
               <w:t xml:space="preserve">packaging.jniLibs.excludes</w:t>
             </w:r>
             <w:r>
-              <w:t xml:space="preserve"> 추가. AGP 공식 소스의 합치기 규칙을 그대로 옮긴 모의 실행에 PC 의 실제 AAR 7개 + jniLibs 를 넣어 1·2차 실패를 똑같이 재현하고, 수정안은 통과(APK lib 6개, 모두 arm64-v8a) 확인. 실제 Gradle 빌드 확인 필요</w:t>
+              <w:t xml:space="preserve"> 추가. AGP 공식 소스의 합치기 규칙을 그대로 옮긴 모의 실행에 PC 의 실제 AAR 7개 + jniLibs 를 넣어 1·2차 실패를 똑같이 재현하고, 수정안은 통과(APK lib 6개, 모두 arm64-v8a) 확인 → 3차 빌드에서 실제로 해결 확인</w:t>
             </w:r>
           </w:p>
         </w:tc>
@@ -1549,7 +1616,108 @@
           </w:tcPr>
           <w:p>
             <w:r>
-              <w:t xml:space="preserve">실기기(S25 Ultra)</w:t>
+              <w:t xml:space="preserve">Gradle 빌드(3차)</w:t>
+            </w:r>
+          </w:p>
+        </w:tc>
+        <w:tc>
+          <w:tcPr>
+            <w:tcW w:type="dxa" w:w="6747"/>
+            <w:tcBorders>
+              <w:top w:val="single" w:color="A0A0A0" w:sz="4"/>
+              <w:left w:val="single" w:color="A0A0A0" w:sz="4"/>
+              <w:bottom w:val="single" w:color="A0A0A0" w:sz="4"/>
+              <w:right w:val="single" w:color="A0A0A0" w:sz="4"/>
+            </w:tcBorders>
+            <w:tcMar>
+              <w:top w:type="dxa" w:w="60"/>
+              <w:left w:type="dxa" w:w="100"/>
+              <w:bottom w:type="dxa" w:w="60"/>
+              <w:right w:type="dxa" w:w="100"/>
+            </w:tcMar>
+          </w:tcPr>
+          <w:p>
+            <w:r>
+              <w:t xml:space="preserve">성공 — 앱 설치·실행 확인(2026-10-10). sherpa 배치는 휴대폰 모델 미설치로 </w:t>
+            </w:r>
+            <w:r>
+              <w:rPr>
+                <w:rFonts w:ascii="Consolas" w:cs="Consolas" w:eastAsia="Consolas" w:hAnsi="Consolas"/>
+              </w:rPr>
+              <w:t xml:space="preserve">MISSING</w:t>
+            </w:r>
+            <w:r>
+              <w:t xml:space="preserve"> 중단(앱 동작은 정상)</w:t>
+            </w:r>
+          </w:p>
+        </w:tc>
+      </w:tr>
+      <w:tr>
+        <w:tc>
+          <w:tcPr>
+            <w:tcW w:type="dxa" w:w="2891"/>
+            <w:tcBorders>
+              <w:top w:val="single" w:color="A0A0A0" w:sz="4"/>
+              <w:left w:val="single" w:color="A0A0A0" w:sz="4"/>
+              <w:bottom w:val="single" w:color="A0A0A0" w:sz="4"/>
+              <w:right w:val="single" w:color="A0A0A0" w:sz="4"/>
+            </w:tcBorders>
+            <w:tcMar>
+              <w:top w:type="dxa" w:w="60"/>
+              <w:left w:type="dxa" w:w="100"/>
+              <w:bottom w:type="dxa" w:w="60"/>
+              <w:right w:type="dxa" w:w="100"/>
+            </w:tcMar>
+          </w:tcPr>
+          <w:p>
+            <w:r>
+              <w:t xml:space="preserve">Logcat 디버그 출력</w:t>
+            </w:r>
+          </w:p>
+        </w:tc>
+        <w:tc>
+          <w:tcPr>
+            <w:tcW w:type="dxa" w:w="6747"/>
+            <w:tcBorders>
+              <w:top w:val="single" w:color="A0A0A0" w:sz="4"/>
+              <w:left w:val="single" w:color="A0A0A0" w:sz="4"/>
+              <w:bottom w:val="single" w:color="A0A0A0" w:sz="4"/>
+              <w:right w:val="single" w:color="A0A0A0" w:sz="4"/>
+            </w:tcBorders>
+            <w:tcMar>
+              <w:top w:type="dxa" w:w="60"/>
+              <w:left w:type="dxa" w:w="100"/>
+              <w:bottom w:type="dxa" w:w="60"/>
+              <w:right w:type="dxa" w:w="100"/>
+            </w:tcMar>
+          </w:tcPr>
+          <w:p>
+            <w:r>
+              <w:t xml:space="preserve">실제 AAR classes.jar 로 앱 소스 전체 컴파일 오류 0건(추가만 93줄, 삭제 0줄)</w:t>
+            </w:r>
+          </w:p>
+        </w:tc>
+      </w:tr>
+      <w:tr>
+        <w:tc>
+          <w:tcPr>
+            <w:tcW w:type="dxa" w:w="2891"/>
+            <w:tcBorders>
+              <w:top w:val="single" w:color="A0A0A0" w:sz="4"/>
+              <w:left w:val="single" w:color="A0A0A0" w:sz="4"/>
+              <w:bottom w:val="single" w:color="A0A0A0" w:sz="4"/>
+              <w:right w:val="single" w:color="A0A0A0" w:sz="4"/>
+            </w:tcBorders>
+            <w:tcMar>
+              <w:top w:type="dxa" w:w="60"/>
+              <w:left w:type="dxa" w:w="100"/>
+              <w:bottom w:type="dxa" w:w="60"/>
+              <w:right w:type="dxa" w:w="100"/>
+            </w:tcMar>
+          </w:tcPr>
+          <w:p>
+            <w:r>
+              <w:t xml:space="preserve">실기기(S25 Ultra) STT</w:t>
             </w:r>
           </w:p>
         </w:tc>
@@ -1576,6 +1744,9 @@
                 <w:bCs/>
               </w:rPr>
               <w:t xml:space="preserve">미실행</w:t>
+            </w:r>
+            <w:r>
+              <w:t xml:space="preserve"> — 모델을 휴대폰에 넣은 뒤 확인</w:t>
             </w:r>
           </w:p>
         </w:tc>

</xml_diff>